<commit_message>
Improve Word document formatting with custom reference styles
Heading hierarchy (H1 dark blue caps, H2 blue bold, H3 medium blue),
proper body text size, list indentation and page margins applied via
custom pandoc reference.docx.

https://claude.ai/code/session_01AMZsrozs1PeDymBUvLt6uV
</commit_message>
<xml_diff>
--- a/KNO_Richtlijnen_Samenvatting.docx
+++ b/KNO_Richtlijnen_Samenvatting.docx
@@ -19321,7 +19321,9 @@
       </w:r>
     </w:p>
     <w:bookmarkEnd w:id="247"/>
-    <w:sectPr/>
+    <w:sectPr>
+      <w:pgMar w:bottom="1417" w:left="1417" w:right="1417" w:top="1417"/>
+    </w:sectPr>
   </w:body>
 </w:document>
 </file>
@@ -20218,15 +20220,32 @@
   <w:style w:default="1" w:styleId="Normal" w:type="paragraph">
     <w:name w:val="Normal"/>
     <w:qFormat/>
+    <w:pPr>
+      <w:spacing w:after="40" w:before="0" w:line="260" w:lineRule="exact"/>
+      <w:ind w:left="850"/>
+    </w:pPr>
+    <w:rPr>
+      <w:rFonts w:ascii="Calibri" w:hAnsi="Calibri"/>
+      <w:b w:val="0"/>
+      <w:i w:val="0"/>
+      <w:color w:val="000000"/>
+      <w:sz w:val="20"/>
+    </w:rPr>
   </w:style>
   <w:style w:styleId="BodyText" w:type="paragraph">
     <w:name w:val="Body Text"/>
     <w:basedOn w:val="Normal"/>
     <w:link w:val="BodyTextChar"/>
     <w:pPr>
-      <w:spacing w:after="180" w:before="180"/>
+      <w:spacing w:after="80" w:before="0"/>
     </w:pPr>
     <w:qFormat/>
+    <w:rPr>
+      <w:rFonts w:ascii="Calibri" w:hAnsi="Calibri"/>
+      <w:b w:val="0"/>
+      <w:i w:val="0"/>
+      <w:sz w:val="20"/>
+    </w:rPr>
   </w:style>
   <w:style w:customStyle="1" w:styleId="FirstParagraph" w:type="paragraph">
     <w:name w:val="First Paragraph"/>
@@ -20239,8 +20258,14 @@
     <w:basedOn w:val="BodyText"/>
     <w:qFormat/>
     <w:pPr>
-      <w:spacing w:after="36" w:before="36"/>
+      <w:spacing w:after="40" w:before="0"/>
     </w:pPr>
+    <w:rPr>
+      <w:rFonts w:ascii="Calibri" w:hAnsi="Calibri"/>
+      <w:b w:val="0"/>
+      <w:i w:val="0"/>
+      <w:sz w:val="20"/>
+    </w:rPr>
   </w:style>
   <w:style w:styleId="Title" w:type="paragraph">
     <w:name w:val="Title"/>
@@ -20349,15 +20374,17 @@
     <w:pPr>
       <w:keepNext/>
       <w:keepLines/>
-      <w:spacing w:after="0" w:before="480"/>
+      <w:spacing w:after="120" w:before="400"/>
       <w:outlineLvl w:val="0"/>
     </w:pPr>
     <w:rPr>
-      <w:rFonts w:asciiTheme="majorHAnsi" w:cstheme="majorBidi" w:eastAsiaTheme="majorEastAsia" w:hAnsiTheme="majorHAnsi"/>
+      <w:rFonts w:ascii="Calibri" w:asciiTheme="majorHAnsi" w:cstheme="majorBidi" w:eastAsiaTheme="majorEastAsia" w:hAnsi="Calibri" w:hAnsiTheme="majorHAnsi"/>
       <w:b/>
       <w:bCs/>
-      <w:color w:themeColor="accent1" w:val="4F81BD"/>
-      <w:sz w:val="32"/>
+      <w:i w:val="0"/>
+      <w:caps/>
+      <w:color w:val="1F497D"/>
+      <w:sz w:val="36"/>
       <w:szCs w:val="32"/>
     </w:rPr>
   </w:style>
@@ -20371,14 +20398,15 @@
     <w:pPr>
       <w:keepNext/>
       <w:keepLines/>
-      <w:spacing w:after="0" w:before="200"/>
+      <w:spacing w:after="80" w:before="280"/>
       <w:outlineLvl w:val="1"/>
     </w:pPr>
     <w:rPr>
-      <w:rFonts w:asciiTheme="majorHAnsi" w:cstheme="majorBidi" w:eastAsiaTheme="majorEastAsia" w:hAnsiTheme="majorHAnsi"/>
+      <w:rFonts w:ascii="Calibri" w:asciiTheme="majorHAnsi" w:cstheme="majorBidi" w:eastAsiaTheme="majorEastAsia" w:hAnsi="Calibri" w:hAnsiTheme="majorHAnsi"/>
       <w:b/>
       <w:bCs/>
-      <w:color w:themeColor="accent1" w:val="4F81BD"/>
+      <w:i w:val="0"/>
+      <w:color w:val="1F497D"/>
       <w:sz w:val="28"/>
       <w:szCs w:val="28"/>
     </w:rPr>
@@ -20393,15 +20421,16 @@
     <w:pPr>
       <w:keepNext/>
       <w:keepLines/>
-      <w:spacing w:after="0" w:before="200"/>
+      <w:spacing w:after="60" w:before="200"/>
       <w:outlineLvl w:val="2"/>
     </w:pPr>
     <w:rPr>
-      <w:rFonts w:asciiTheme="majorHAnsi" w:cstheme="majorBidi" w:eastAsiaTheme="majorEastAsia" w:hAnsiTheme="majorHAnsi"/>
+      <w:rFonts w:ascii="Calibri" w:asciiTheme="majorHAnsi" w:cstheme="majorBidi" w:eastAsiaTheme="majorEastAsia" w:hAnsi="Calibri" w:hAnsiTheme="majorHAnsi"/>
       <w:b/>
       <w:bCs/>
-      <w:color w:themeColor="accent1" w:val="4F81BD"/>
-      <w:sz w:val="24"/>
+      <w:i w:val="0"/>
+      <w:color w:val="4472C4"/>
+      <w:sz w:val="22"/>
       <w:szCs w:val="24"/>
     </w:rPr>
   </w:style>
@@ -20415,15 +20444,16 @@
     <w:pPr>
       <w:keepNext/>
       <w:keepLines/>
-      <w:spacing w:after="0" w:before="200"/>
+      <w:spacing w:after="40" w:before="160"/>
       <w:outlineLvl w:val="3"/>
     </w:pPr>
     <w:rPr>
-      <w:rFonts w:asciiTheme="majorHAnsi" w:cstheme="majorBidi" w:eastAsiaTheme="majorEastAsia" w:hAnsiTheme="majorHAnsi"/>
+      <w:rFonts w:ascii="Calibri" w:asciiTheme="majorHAnsi" w:cstheme="majorBidi" w:eastAsiaTheme="majorEastAsia" w:hAnsi="Calibri" w:hAnsiTheme="majorHAnsi"/>
       <w:i/>
+      <w:b/>
       <w:bCs/>
-      <w:color w:themeColor="accent1" w:val="4F81BD"/>
-      <w:sz w:val="24"/>
+      <w:color w:val="404040"/>
+      <w:sz w:val="20"/>
       <w:szCs w:val="24"/>
     </w:rPr>
   </w:style>
@@ -20643,8 +20673,8 @@
     <w:name w:val="Verbatim Char"/>
     <w:basedOn w:val="BodyTextChar"/>
     <w:rPr>
-      <w:rFonts w:ascii="Consolas" w:hAnsi="Consolas"/>
-      <w:sz w:val="22"/>
+      <w:rFonts w:ascii="Courier New" w:hAnsi="Courier New"/>
+      <w:sz w:val="18"/>
     </w:rPr>
   </w:style>
   <w:style w:customStyle="1" w:styleId="SectionNumber" w:type="character">

</xml_diff>